<commit_message>
París: The clochard / El clochard
Gemelo español de The clochard, aprobado y propagado a Paris.tex y
Paris_es.tex. El inglés toma "half a winter" del español; el español
toma "cuatro libros" del inglés. Bilingüe suelto en substack/clochard
(tex, pdf, docx, pages) y candidatas de imagen en dominio público en
substack/imgs (Nonell, Steinlen, Raffaëlli).

Co-Authored-By: Claude Opus 5.5 <noreply@anthropic.com>
</commit_message>
<xml_diff>
--- a/Paris/Paris_es.docx
+++ b/Paris/Paris_es.docx
@@ -1092,6 +1092,132 @@
       </w:r>
     </w:p>
     <w:bookmarkEnd w:id="14"/>
+    <w:bookmarkStart w:id="15" w:name="el-clochard"/>
+    <w:p>
+      <w:pPr>
+        <w:pStyle w:val="Heading2"/>
+      </w:pPr>
+      <w:r>
+        <w:t xml:space="preserve">El clochard</w:t>
+      </w:r>
+    </w:p>
+    <w:p>
+      <w:pPr>
+        <w:pStyle w:val="FirstParagraph"/>
+      </w:pPr>
+      <w:r>
+        <w:t xml:space="preserve">El vagabundo que pernocta siempre en el mismo portal</w:t>
+      </w:r>
+      <w:r>
+        <w:br/>
+      </w:r>
+      <w:r>
+        <w:t xml:space="preserve">de un edificio del Boulevard du Montparnasse</w:t>
+      </w:r>
+      <w:r>
+        <w:br/>
+      </w:r>
+      <w:r>
+        <w:t xml:space="preserve">es dueño de un colchón desvencijado,</w:t>
+      </w:r>
+      <w:r>
+        <w:br/>
+      </w:r>
+      <w:r>
+        <w:t xml:space="preserve">una sucia manta, una almohada deshilachada</w:t>
+      </w:r>
+      <w:r>
+        <w:br/>
+      </w:r>
+      <w:r>
+        <w:t xml:space="preserve">y cuatro libros.</w:t>
+      </w:r>
+    </w:p>
+    <w:p>
+      <w:pPr>
+        <w:pStyle w:val="BodyText"/>
+      </w:pPr>
+      <w:r>
+        <w:t xml:space="preserve">A menudo se sienta, en cuclillas, como un viejo buitre,</w:t>
+      </w:r>
+      <w:r>
+        <w:br/>
+      </w:r>
+      <w:r>
+        <w:t xml:space="preserve">sobre las rejillas metálicas que dan al metro,</w:t>
+      </w:r>
+      <w:r>
+        <w:br/>
+      </w:r>
+      <w:r>
+        <w:t xml:space="preserve">descalzo, la larga barba de color nieve, una botella</w:t>
+      </w:r>
+      <w:r>
+        <w:br/>
+      </w:r>
+      <w:r>
+        <w:t xml:space="preserve">de vodka en la mano.</w:t>
+      </w:r>
+      <w:r>
+        <w:br/>
+      </w:r>
+      <w:r>
+        <w:t xml:space="preserve">Envuelto en andrajos, caldeado por el humo que sale del subterráneo,</w:t>
+      </w:r>
+      <w:r>
+        <w:br/>
+      </w:r>
+      <w:r>
+        <w:t xml:space="preserve">sus libros como toda compañía.</w:t>
+      </w:r>
+    </w:p>
+    <w:p>
+      <w:pPr>
+        <w:pStyle w:val="BodyText"/>
+      </w:pPr>
+      <w:r>
+        <w:t xml:space="preserve">A veces mira a la nada,</w:t>
+      </w:r>
+      <w:r>
+        <w:br/>
+      </w:r>
+      <w:r>
+        <w:t xml:space="preserve">como buscando un sentido a la vida.</w:t>
+      </w:r>
+      <w:r>
+        <w:br/>
+      </w:r>
+      <w:r>
+        <w:t xml:space="preserve">Otras le veo leyendo,</w:t>
+      </w:r>
+      <w:r>
+        <w:br/>
+      </w:r>
+      <w:r>
+        <w:t xml:space="preserve">distinguido y lánguido, como un duque en su biblioteca.</w:t>
+      </w:r>
+    </w:p>
+    <w:p>
+      <w:pPr>
+        <w:pStyle w:val="BodyText"/>
+      </w:pPr>
+      <w:r>
+        <w:t xml:space="preserve">A su lado, los turistas</w:t>
+      </w:r>
+      <w:r>
+        <w:br/>
+      </w:r>
+      <w:r>
+        <w:t xml:space="preserve">gastan, en una entrada al museo de arte moderno,</w:t>
+      </w:r>
+      <w:r>
+        <w:br/>
+      </w:r>
+      <w:r>
+        <w:t xml:space="preserve">lo que él necesita para sobrevivir medio invierno.</w:t>
+      </w:r>
+    </w:p>
+    <w:bookmarkEnd w:id="15"/>
     <w:sectPr>
       <w:footnotePr>
         <w:numRestart w:val="eachSect"/>

</xml_diff>